<commit_message>
updated cp, maked .txt, deleted .docx
</commit_message>
<xml_diff>
--- a/CP/КП МДК.02.01 2026 Горбунов.docx
+++ b/CP/КП МДК.02.01 2026 Горбунов.docx
@@ -1,6 +1,6 @@
 
 <file path=word/document.xml><?xml version="1.0" encoding="utf-8"?>
-<w:document xmlns:wpc="http://schemas.microsoft.com/office/word/2010/wordprocessingCanvas" xmlns:cx="http://schemas.microsoft.com/office/drawing/2014/chartex" xmlns:cx1="http://schemas.microsoft.com/office/drawing/2015/9/8/chartex" xmlns:cx2="http://schemas.microsoft.com/office/drawing/2015/10/21/chartex" xmlns:cx3="http://schemas.microsoft.com/office/drawing/2016/5/9/chartex" xmlns:cx4="http://schemas.microsoft.com/office/drawing/2016/5/10/chartex" xmlns:cx5="http://schemas.microsoft.com/office/drawing/2016/5/11/chartex" xmlns:cx6="http://schemas.microsoft.com/office/drawing/2016/5/12/chartex" xmlns:cx7="http://schemas.microsoft.com/office/drawing/2016/5/13/chartex" xmlns:cx8="http://schemas.microsoft.com/office/drawing/2016/5/14/chartex" xmlns:mc="http://schemas.openxmlformats.org/markup-compatibility/2006" xmlns:aink="http://schemas.microsoft.com/office/drawing/2016/ink" xmlns:am3d="http://schemas.microsoft.com/office/drawing/2017/model3d" xmlns:o="urn:schemas-microsoft-com:office:office" xmlns:r="http://schemas.openxmlformats.org/officeDocument/2006/relationships" xmlns:m="http://schemas.openxmlformats.org/officeDocument/2006/math" xmlns:v="urn:schemas-microsoft-com:vml" xmlns:wp14="http://schemas.microsoft.com/office/word/2010/wordprocessingDrawing" xmlns:wp="http://schemas.openxmlformats.org/drawingml/2006/wordprocessingDrawing" xmlns:w10="urn:schemas-microsoft-com:office:word" xmlns:w="http://schemas.openxmlformats.org/wordprocessingml/2006/main" xmlns:w14="http://schemas.microsoft.com/office/word/2010/wordml" xmlns:w15="http://schemas.microsoft.com/office/word/2012/wordml" xmlns:w16cex="http://schemas.microsoft.com/office/word/2018/wordml/cex" xmlns:w16cid="http://schemas.microsoft.com/office/word/2016/wordml/cid" xmlns:w16="http://schemas.microsoft.com/office/word/2018/wordml" xmlns:w16sdtdh="http://schemas.microsoft.com/office/word/2020/wordml/sdtdatahash" xmlns:w16se="http://schemas.microsoft.com/office/word/2015/wordml/symex" xmlns:wpg="http://schemas.microsoft.com/office/word/2010/wordprocessingGroup" xmlns:wpi="http://schemas.microsoft.com/office/word/2010/wordprocessingInk" xmlns:wne="http://schemas.microsoft.com/office/word/2006/wordml" xmlns:wps="http://schemas.microsoft.com/office/word/2010/wordprocessingShape" mc:Ignorable="w14 w15 w16se w16cid w16 w16cex w16sdtdh wp14">
+<w:document xmlns:wpc="http://schemas.microsoft.com/office/word/2010/wordprocessingCanvas" xmlns:cx="http://schemas.microsoft.com/office/drawing/2014/chartex" xmlns:mc="http://schemas.openxmlformats.org/markup-compatibility/2006" xmlns:o="urn:schemas-microsoft-com:office:office" xmlns:r="http://schemas.openxmlformats.org/officeDocument/2006/relationships" xmlns:m="http://schemas.openxmlformats.org/officeDocument/2006/math" xmlns:v="urn:schemas-microsoft-com:vml" xmlns:wp14="http://schemas.microsoft.com/office/word/2010/wordprocessingDrawing" xmlns:wp="http://schemas.openxmlformats.org/drawingml/2006/wordprocessingDrawing" xmlns:w10="urn:schemas-microsoft-com:office:word" xmlns:w="http://schemas.openxmlformats.org/wordprocessingml/2006/main" xmlns:w14="http://schemas.microsoft.com/office/word/2010/wordml" xmlns:w15="http://schemas.microsoft.com/office/word/2012/wordml" xmlns:w16se="http://schemas.microsoft.com/office/word/2015/wordml/symex" xmlns:wpg="http://schemas.microsoft.com/office/word/2010/wordprocessingGroup" xmlns:wpi="http://schemas.microsoft.com/office/word/2010/wordprocessingInk" xmlns:wne="http://schemas.microsoft.com/office/word/2006/wordml" xmlns:wps="http://schemas.microsoft.com/office/word/2010/wordprocessingShape" mc:Ignorable="w14 w15 w16se wp14">
   <w:body>
     <w:p>
       <w:pPr>
@@ -63,33 +63,33 @@
           <w:b/>
           <w:bCs/>
         </w:rPr>
-        <w:t>(СПбГУТ)</w:t>
-      </w:r>
-    </w:p>
-    <w:p>
-      <w:pPr>
-        <w:jc w:val="center"/>
+        <w:t>(</w:t>
+      </w:r>
+      <w:proofErr w:type="spellStart"/>
+      <w:r>
         <w:rPr>
           <w:b/>
           <w:bCs/>
         </w:rPr>
-      </w:pPr>
-    </w:p>
-    <w:p>
-      <w:pPr>
-        <w:jc w:val="center"/>
+        <w:t>СПбГУТ</w:t>
+      </w:r>
+      <w:proofErr w:type="spellEnd"/>
+      <w:r>
         <w:rPr>
           <w:b/>
           <w:bCs/>
         </w:rPr>
-      </w:pPr>
-      <w:r>
+        <w:t>)</w:t>
+      </w:r>
+    </w:p>
+    <w:p>
+      <w:pPr>
+        <w:jc w:val="center"/>
         <w:rPr>
           <w:b/>
           <w:bCs/>
         </w:rPr>
-        <w:t>АРХАНГЕЛЬСКИЙ КОЛЛЕДЖ ТЕЛЕКОММУНИКАЦИЙ</w:t>
-      </w:r>
+      </w:pPr>
     </w:p>
     <w:p>
       <w:pPr>
@@ -104,30 +104,71 @@
           <w:b/>
           <w:bCs/>
         </w:rPr>
-        <w:t xml:space="preserve">ИМ. Б.Л. РОЗИНГА </w:t>
-      </w:r>
-      <w:r>
+        <w:t>АРХАНГЕЛЬСКИЙ КОЛЛЕДЖ ТЕЛЕКОММУНИКАЦИЙ</w:t>
+      </w:r>
+    </w:p>
+    <w:p>
+      <w:pPr>
+        <w:jc w:val="center"/>
         <w:rPr>
           <w:b/>
           <w:bCs/>
         </w:rPr>
-        <w:t>(ФИЛИАЛ) СПбГУТ</w:t>
-      </w:r>
-    </w:p>
-    <w:p>
-      <w:pPr>
-        <w:jc w:val="center"/>
+      </w:pPr>
+      <w:r>
         <w:rPr>
           <w:b/>
           <w:bCs/>
         </w:rPr>
-      </w:pPr>
+        <w:t xml:space="preserve">ИМ. Б.Л. РОЗИНГА </w:t>
+      </w:r>
       <w:r>
         <w:rPr>
           <w:b/>
           <w:bCs/>
         </w:rPr>
-        <w:t>(АКТ (ф) СПбГУТ)</w:t>
+        <w:t xml:space="preserve">(ФИЛИАЛ) </w:t>
+      </w:r>
+      <w:proofErr w:type="spellStart"/>
+      <w:r>
+        <w:rPr>
+          <w:b/>
+          <w:bCs/>
+        </w:rPr>
+        <w:t>СПбГУТ</w:t>
+      </w:r>
+      <w:proofErr w:type="spellEnd"/>
+    </w:p>
+    <w:p>
+      <w:pPr>
+        <w:jc w:val="center"/>
+        <w:rPr>
+          <w:b/>
+          <w:bCs/>
+        </w:rPr>
+      </w:pPr>
+      <w:r>
+        <w:rPr>
+          <w:b/>
+          <w:bCs/>
+        </w:rPr>
+        <w:t xml:space="preserve">(АКТ (ф) </w:t>
+      </w:r>
+      <w:proofErr w:type="spellStart"/>
+      <w:r>
+        <w:rPr>
+          <w:b/>
+          <w:bCs/>
+        </w:rPr>
+        <w:t>СПбГУТ</w:t>
+      </w:r>
+      <w:proofErr w:type="spellEnd"/>
+      <w:r>
+        <w:rPr>
+          <w:b/>
+          <w:bCs/>
+        </w:rPr>
+        <w:t>)</w:t>
       </w:r>
     </w:p>
     <w:p>
@@ -2304,6 +2345,17 @@
         <w:pStyle w:val="a5"/>
       </w:pPr>
       <w:r>
+        <w:t xml:space="preserve">ИС – информационная </w:t>
+      </w:r>
+      <w:r>
+        <w:t>система</w:t>
+      </w:r>
+    </w:p>
+    <w:p>
+      <w:pPr>
+        <w:pStyle w:val="a5"/>
+      </w:pPr>
+      <w:r>
         <w:t>ОС – операционная система</w:t>
       </w:r>
     </w:p>
@@ -2734,30 +2786,24 @@
         <w:t>ую</w:t>
       </w:r>
       <w:r>
-        <w:t xml:space="preserve"> информационн</w:t>
+        <w:t xml:space="preserve"> </w:t>
+      </w:r>
+      <w:r>
+        <w:t>ИС</w:t>
+      </w:r>
+      <w:r>
+        <w:t xml:space="preserve"> «Реплика»</w:t>
+      </w:r>
+      <w:r>
+        <w:t xml:space="preserve">, </w:t>
+      </w:r>
+      <w:r>
+        <w:t>предназначенн</w:t>
       </w:r>
       <w:r>
         <w:t>ую</w:t>
       </w:r>
       <w:r>
-        <w:t xml:space="preserve"> систе</w:t>
-      </w:r>
-      <w:r>
-        <w:t>му</w:t>
-      </w:r>
-      <w:r>
-        <w:t xml:space="preserve"> «Реплика»</w:t>
-      </w:r>
-      <w:r>
-        <w:t xml:space="preserve">, </w:t>
-      </w:r>
-      <w:r>
-        <w:t>предназначенн</w:t>
-      </w:r>
-      <w:r>
-        <w:t>ую</w:t>
-      </w:r>
-      <w:r>
         <w:t xml:space="preserve"> для </w:t>
       </w:r>
       <w:r>
@@ -2770,7 +2816,10 @@
         <w:t xml:space="preserve"> в режиме реального времени через веб-интерфейс</w:t>
       </w:r>
       <w:r>
-        <w:t xml:space="preserve"> и обеспечения хранения данных, связанных с пользователями информационной системы</w:t>
+        <w:t xml:space="preserve"> и обеспечения хранения данных, связанных с пользователями</w:t>
+      </w:r>
+      <w:r>
+        <w:t xml:space="preserve"> ИС</w:t>
       </w:r>
       <w:r>
         <w:t>.</w:t>
@@ -2811,7 +2860,13 @@
         <w:t>п</w:t>
       </w:r>
       <w:r>
-        <w:t>ровести сбор и анализ требований к разрабатываемому веб-чату «Реплика», определить его функциональные и нефункциональные требования</w:t>
+        <w:t xml:space="preserve">ровести сбор и анализ требований к разрабатываемому веб-чату «Реплика», </w:t>
+      </w:r>
+      <w:r>
+        <w:t xml:space="preserve">определить его функциональные </w:t>
+      </w:r>
+      <w:r>
+        <w:t>требования</w:t>
       </w:r>
       <w:r>
         <w:t>;</w:t>
@@ -2834,7 +2889,13 @@
         <w:t>с</w:t>
       </w:r>
       <w:r>
-        <w:t>проектировать структуру базы данных для хранения информации о пользователях, сообщениях и истории переписки</w:t>
+        <w:t xml:space="preserve">проектировать структуру базы данных для хранения информации о пользователях, </w:t>
+      </w:r>
+      <w:r>
+        <w:t>чатах и историях</w:t>
+      </w:r>
+      <w:r>
+        <w:t xml:space="preserve"> переписки</w:t>
       </w:r>
       <w:r>
         <w:t>;</w:t>
@@ -3027,7 +3088,54 @@
         <w:pStyle w:val="ae"/>
       </w:pPr>
       <w:r>
-        <w:t xml:space="preserve">Пользователями веб-чата являются зарегистрированные пользователи, которые используют </w:t>
+        <w:t xml:space="preserve">Веб-чат «Реплика» предназначен для </w:t>
+      </w:r>
+      <w:r>
+        <w:t>личного общения</w:t>
+      </w:r>
+      <w:r>
+        <w:t xml:space="preserve"> </w:t>
+      </w:r>
+      <w:r>
+        <w:t>(отправки и получения сообщений)</w:t>
+      </w:r>
+      <w:r>
+        <w:t xml:space="preserve">, </w:t>
+      </w:r>
+      <w:r>
+        <w:t>просмотра истории</w:t>
+      </w:r>
+      <w:r>
+        <w:t xml:space="preserve"> переписки</w:t>
+      </w:r>
+      <w:r>
+        <w:t xml:space="preserve">, </w:t>
+      </w:r>
+      <w:r>
+        <w:t>обмена информацией и организаци</w:t>
+      </w:r>
+      <w:r>
+        <w:t>и</w:t>
+      </w:r>
+      <w:r>
+        <w:t xml:space="preserve"> взаимодействия между участниками в группах через сеть Интернет или</w:t>
+      </w:r>
+      <w:r>
+        <w:t xml:space="preserve"> локальную сеть.</w:t>
+      </w:r>
+    </w:p>
+    <w:p>
+      <w:pPr>
+        <w:pStyle w:val="ae"/>
+      </w:pPr>
+      <w:r>
+        <w:t xml:space="preserve">Областью применения является сфера корпоративных и межличностных коммуникаций. </w:t>
+      </w:r>
+      <w:r>
+        <w:t xml:space="preserve">Пользователями </w:t>
+      </w:r>
+      <w:r>
+        <w:t xml:space="preserve">веб-чата являются зарегистрированные пользователи, которые используют </w:t>
       </w:r>
       <w:r>
         <w:t xml:space="preserve">систему </w:t>
@@ -3036,7 +3144,10 @@
         <w:t xml:space="preserve">для обмена информацией. </w:t>
       </w:r>
       <w:r>
-        <w:t xml:space="preserve">Так же в системе будет </w:t>
+        <w:t>Так</w:t>
+      </w:r>
+      <w:r>
+        <w:t xml:space="preserve">же в системе будет </w:t>
       </w:r>
       <w:r>
         <w:t xml:space="preserve">выделена </w:t>
@@ -3056,24 +3167,29 @@
     </w:p>
     <w:p>
       <w:pPr>
+        <w:pStyle w:val="2"/>
+      </w:pPr>
+      <w:r>
+        <w:t>Постановка задачи</w:t>
+      </w:r>
+    </w:p>
+    <w:p>
+      <w:pPr>
         <w:pStyle w:val="ae"/>
-      </w:pPr>
-      <w:r>
-        <w:t xml:space="preserve">Веб-чат «Реплика» представляет собой веб-приложение, предназначенное </w:t>
-      </w:r>
-      <w:r>
-        <w:t xml:space="preserve">для </w:t>
-      </w:r>
-      <w:r>
-        <w:t>личного общения и обмена информацией и организацией взаимодействия между участниками в группах через сеть Интернет или локальную сеть. Основным назначением программного продукта является предоставление удобного инструмента для общения, позволяющего отправлять и получать сообщения и просматривать историю переписки.</w:t>
-      </w:r>
-    </w:p>
-    <w:p>
-      <w:pPr>
-        <w:pStyle w:val="2"/>
-      </w:pPr>
-      <w:r>
-        <w:t>Постановка задачи</w:t>
+        <w:tabs>
+          <w:tab w:val="left" w:pos="993"/>
+        </w:tabs>
+      </w:pPr>
+      <w:r>
+        <w:t>Требуется р</w:t>
+      </w:r>
+      <w:r>
+        <w:t>азработа</w:t>
+      </w:r>
+      <w:bookmarkStart w:id="2" w:name="_GoBack"/>
+      <w:bookmarkEnd w:id="2"/>
+      <w:r>
+        <w:t>ть многопользовательское веб-приложение, предоставляющее пользователям возможность переписываться в личных сообщениях в реальном времени и создавать группы для массового обсуждения с возможностью вступления в них по приглашению. В приложении должна быть возможность переключения темы.</w:t>
       </w:r>
     </w:p>
     <w:p>
@@ -3084,7 +3200,7 @@
         </w:tabs>
       </w:pPr>
       <w:r>
-        <w:t>Разработать многопользовательское веб-приложение, предоставляющее пользователям возможность переписываться в личных сообщениях в реальном времени и создавать группы для массового обсуждения с возможностью вступления в них по приглашению. В приложении должна быть возможность переключения темы.</w:t>
+        <w:t xml:space="preserve">Неавторизованные пользователи должны иметь возможность перейти к регистрации или авторизации, но не должны получать доступ к личной переписке. </w:t>
       </w:r>
     </w:p>
     <w:p>
@@ -3095,28 +3211,7 @@
         </w:tabs>
       </w:pPr>
       <w:r>
-        <w:t>Э</w:t>
-      </w:r>
-      <w:r>
-        <w:t>ксплуатационны</w:t>
-      </w:r>
-      <w:r>
-        <w:t>е</w:t>
-      </w:r>
-      <w:r>
-        <w:t xml:space="preserve"> требования</w:t>
-      </w:r>
-      <w:r>
-        <w:t xml:space="preserve"> к</w:t>
-      </w:r>
-      <w:r>
-        <w:t xml:space="preserve"> </w:t>
-      </w:r>
-      <w:r>
-        <w:t>интерфейсу</w:t>
-      </w:r>
-      <w:r>
-        <w:t>:</w:t>
+        <w:t>Для зарегистрированных пользователей веб-чат должен обеспечивать выполнение следующих основных функций:</w:t>
       </w:r>
     </w:p>
     <w:p>
@@ -3132,7 +3227,7 @@
         <w:ind w:left="0" w:firstLine="709"/>
       </w:pPr>
       <w:r>
-        <w:t>обеспечивать простоту и удобство использования;</w:t>
+        <w:t>просмотр списка чатов;</w:t>
       </w:r>
     </w:p>
     <w:p>
@@ -3148,7 +3243,7 @@
         <w:ind w:left="0" w:firstLine="709"/>
       </w:pPr>
       <w:r>
-        <w:t>иметь понятную структуру и единый стиль оформления;</w:t>
+        <w:t>отправку и получение текстовых сообщений;</w:t>
       </w:r>
     </w:p>
     <w:p>
@@ -3164,7 +3259,7 @@
         <w:ind w:left="0" w:firstLine="709"/>
       </w:pPr>
       <w:r>
-        <w:t>поддерживать отправку и получение сообщений без перезагрузки страницы;</w:t>
+        <w:t>просмотр истории переписки;</w:t>
       </w:r>
     </w:p>
     <w:p>
@@ -3180,18 +3275,7 @@
         <w:ind w:left="0" w:firstLine="709"/>
       </w:pPr>
       <w:r>
-        <w:t>сохранность истории сообщений.</w:t>
-      </w:r>
-    </w:p>
-    <w:p>
-      <w:pPr>
-        <w:pStyle w:val="ae"/>
-        <w:tabs>
-          <w:tab w:val="left" w:pos="993"/>
-        </w:tabs>
-      </w:pPr>
-      <w:r>
-        <w:t>Эксплуатационные требования к защите данных:</w:t>
+        <w:t>поиск пользователей в чатах и сообщений в чате;</w:t>
       </w:r>
     </w:p>
     <w:p>
@@ -3207,31 +3291,25 @@
         <w:ind w:left="0" w:firstLine="709"/>
       </w:pPr>
       <w:r>
-        <w:t>обеспе</w:t>
-      </w:r>
-      <w:r>
-        <w:t>чивать</w:t>
-      </w:r>
-      <w:r>
-        <w:t xml:space="preserve"> безопасн</w:t>
-      </w:r>
-      <w:r>
-        <w:t>ую</w:t>
-      </w:r>
-      <w:r>
-        <w:t xml:space="preserve"> авторизаци</w:t>
-      </w:r>
-      <w:r>
-        <w:t>ю</w:t>
-      </w:r>
-      <w:r>
-        <w:t xml:space="preserve"> пользователей</w:t>
-      </w:r>
-      <w:r>
-        <w:rPr>
-          <w:lang w:val="en-US"/>
-        </w:rPr>
-        <w:t>;</w:t>
+        <w:lastRenderedPageBreak/>
+        <w:t>выход из учётной записи</w:t>
+      </w:r>
+      <w:r>
+        <w:t>.</w:t>
+      </w:r>
+    </w:p>
+    <w:p>
+      <w:pPr>
+        <w:pStyle w:val="ae"/>
+        <w:tabs>
+          <w:tab w:val="left" w:pos="993"/>
+        </w:tabs>
+      </w:pPr>
+      <w:r>
+        <w:t>Зарегистрированные пользователи должны иметь возможность создавать группы. Владельцы групп должны иметь следующие функции</w:t>
+      </w:r>
+      <w:r>
+        <w:t>:</w:t>
       </w:r>
     </w:p>
     <w:p>
@@ -3247,16 +3325,9 @@
         <w:ind w:left="0" w:firstLine="709"/>
       </w:pPr>
       <w:r>
-        <w:lastRenderedPageBreak/>
-        <w:t xml:space="preserve">иметь </w:t>
-      </w:r>
-      <w:r>
-        <w:t>разграничение прав доступа</w:t>
-      </w:r>
-      <w:r>
-        <w:rPr>
-          <w:lang w:val="en-US"/>
-        </w:rPr>
+        <w:t>приглашение и удаление пользователей из группы</w:t>
+      </w:r>
+      <w:r>
         <w:t>;</w:t>
       </w:r>
     </w:p>
@@ -3273,25 +3344,36 @@
         <w:ind w:left="0" w:firstLine="709"/>
       </w:pPr>
       <w:r>
-        <w:t>храни</w:t>
-      </w:r>
-      <w:r>
-        <w:t>ть</w:t>
-      </w:r>
-      <w:r>
-        <w:t xml:space="preserve"> парол</w:t>
-      </w:r>
-      <w:r>
-        <w:t>и</w:t>
-      </w:r>
-      <w:r>
-        <w:t xml:space="preserve"> в виде</w:t>
-      </w:r>
-      <w:r>
-        <w:t xml:space="preserve"> криптографических</w:t>
-      </w:r>
-      <w:r>
-        <w:t xml:space="preserve"> хэшей;</w:t>
+        <w:t>изменение описания и названия группы.</w:t>
+      </w:r>
+    </w:p>
+    <w:p>
+      <w:pPr>
+        <w:pStyle w:val="ae"/>
+        <w:tabs>
+          <w:tab w:val="left" w:pos="993"/>
+        </w:tabs>
+      </w:pPr>
+      <w:r>
+        <w:t>В веб-приложении предусматривается</w:t>
+      </w:r>
+      <w:r>
+        <w:t xml:space="preserve"> </w:t>
+      </w:r>
+      <w:r>
+        <w:t>роль администратора, который должен иметь</w:t>
+      </w:r>
+      <w:r>
+        <w:t xml:space="preserve"> </w:t>
+      </w:r>
+      <w:r>
+        <w:t xml:space="preserve">следующие </w:t>
+      </w:r>
+      <w:r>
+        <w:t>функции</w:t>
+      </w:r>
+      <w:r>
+        <w:t>:</w:t>
       </w:r>
     </w:p>
     <w:p>
@@ -3307,7 +3389,7 @@
         <w:ind w:left="0" w:firstLine="709"/>
       </w:pPr>
       <w:r>
-        <w:t>необходимо предусмотреть резервное копирование базы данных</w:t>
+        <w:t>оповещение пользователей о технических работах в специальном чате поддержки</w:t>
       </w:r>
       <w:r>
         <w:t>;</w:t>
@@ -3326,19 +3408,7 @@
         <w:ind w:left="0" w:firstLine="709"/>
       </w:pPr>
       <w:r>
-        <w:t>провер</w:t>
-      </w:r>
-      <w:r>
-        <w:t>ять</w:t>
-      </w:r>
-      <w:r>
-        <w:t xml:space="preserve"> полномочи</w:t>
-      </w:r>
-      <w:r>
-        <w:t>я</w:t>
-      </w:r>
-      <w:r>
-        <w:t xml:space="preserve"> пользователей при выполнении запросов.</w:t>
+        <w:t>временная блокировка пользователей, проявляющих некорректное поведение.</w:t>
       </w:r>
     </w:p>
     <w:p>
@@ -3349,36 +3419,16 @@
         </w:tabs>
       </w:pPr>
       <w:r>
-        <w:t>Запуск приложения на стороне пользователя должен выполняться открыти</w:t>
-      </w:r>
-      <w:r>
-        <w:t>е</w:t>
-      </w:r>
-      <w:r>
-        <w:t xml:space="preserve"> адреса веб-чата в веб-браузере. Серверная часть должна быть предварительно установлена</w:t>
-      </w:r>
-      <w:r>
-        <w:t xml:space="preserve">, </w:t>
-      </w:r>
-      <w:r>
-        <w:t>настроена</w:t>
-      </w:r>
-      <w:r>
-        <w:t xml:space="preserve"> и запущена</w:t>
-      </w:r>
-      <w:r>
-        <w:t xml:space="preserve"> на сервере.</w:t>
-      </w:r>
-    </w:p>
-    <w:p>
-      <w:pPr>
-        <w:pStyle w:val="ae"/>
-        <w:tabs>
-          <w:tab w:val="left" w:pos="993"/>
-        </w:tabs>
-      </w:pPr>
-      <w:r>
-        <w:t>Для зарегистрированных пользователей веб-чат должен обеспечивать выполнение следующих основных функций:</w:t>
+        <w:t>К</w:t>
+      </w:r>
+      <w:r>
+        <w:t xml:space="preserve"> интерфейсу</w:t>
+      </w:r>
+      <w:r>
+        <w:t xml:space="preserve"> предъявляются следующие </w:t>
+      </w:r>
+      <w:r>
+        <w:t>требования:</w:t>
       </w:r>
     </w:p>
     <w:p>
@@ -3394,7 +3444,7 @@
         <w:ind w:left="0" w:firstLine="709"/>
       </w:pPr>
       <w:r>
-        <w:t>регистрацию новых пользователей;</w:t>
+        <w:t>обеспечивать простоту и удобство использования;</w:t>
       </w:r>
     </w:p>
     <w:p>
@@ -3410,7 +3460,7 @@
         <w:ind w:left="0" w:firstLine="709"/>
       </w:pPr>
       <w:r>
-        <w:t>авторизацию пользователей с использованием учётных данных;</w:t>
+        <w:t>иметь понятную структуру и единый стиль оформления;</w:t>
       </w:r>
     </w:p>
     <w:p>
@@ -3426,7 +3476,7 @@
         <w:ind w:left="0" w:firstLine="709"/>
       </w:pPr>
       <w:r>
-        <w:t>просмотр списка чатов;</w:t>
+        <w:t>поддерживать отправку и получение сообщений без перезагрузки страницы;</w:t>
       </w:r>
     </w:p>
     <w:p>
@@ -3442,7 +3492,27 @@
         <w:ind w:left="0" w:firstLine="709"/>
       </w:pPr>
       <w:r>
-        <w:t>отправку и получение текстовых сообщений;</w:t>
+        <w:t>сохранность истории сообщений.</w:t>
+      </w:r>
+    </w:p>
+    <w:p>
+      <w:pPr>
+        <w:pStyle w:val="ae"/>
+        <w:tabs>
+          <w:tab w:val="left" w:pos="993"/>
+        </w:tabs>
+      </w:pPr>
+      <w:r>
+        <w:t>К</w:t>
+      </w:r>
+      <w:r>
+        <w:t xml:space="preserve"> защите данных</w:t>
+      </w:r>
+      <w:r>
+        <w:t xml:space="preserve"> предъявляются следующие </w:t>
+      </w:r>
+      <w:r>
+        <w:t>требования:</w:t>
       </w:r>
     </w:p>
     <w:p>
@@ -3458,7 +3528,22 @@
         <w:ind w:left="0" w:firstLine="709"/>
       </w:pPr>
       <w:r>
-        <w:t>просмотр истории переписки;</w:t>
+        <w:t>обеспе</w:t>
+      </w:r>
+      <w:r>
+        <w:t>чивать</w:t>
+      </w:r>
+      <w:r>
+        <w:t xml:space="preserve"> безопасный вход </w:t>
+      </w:r>
+      <w:r>
+        <w:t>пользователей</w:t>
+      </w:r>
+      <w:r>
+        <w:t xml:space="preserve"> (идентификация по пользовательским данным, аутентификация личности и авторизация)</w:t>
+      </w:r>
+      <w:r>
+        <w:t>;</w:t>
       </w:r>
     </w:p>
     <w:p>
@@ -3474,7 +3559,16 @@
         <w:ind w:left="0" w:firstLine="709"/>
       </w:pPr>
       <w:r>
-        <w:t>поиск пользователей в чатах и сообщений в чате;</w:t>
+        <w:t xml:space="preserve">иметь </w:t>
+      </w:r>
+      <w:r>
+        <w:t>разграничение прав доступа</w:t>
+      </w:r>
+      <w:r>
+        <w:rPr>
+          <w:lang w:val="en-US"/>
+        </w:rPr>
+        <w:t>;</w:t>
       </w:r>
     </w:p>
     <w:p>
@@ -3490,178 +3584,33 @@
         <w:ind w:left="0" w:firstLine="709"/>
       </w:pPr>
       <w:r>
-        <w:t>выход из учётной записи.</w:t>
-      </w:r>
-    </w:p>
-    <w:p>
-      <w:pPr>
-        <w:pStyle w:val="ae"/>
-        <w:tabs>
-          <w:tab w:val="left" w:pos="993"/>
-        </w:tabs>
-      </w:pPr>
-      <w:r>
-        <w:t>Неавторизованные пользователи должны иметь возможность перейти к регистрации или авторизации, но не должны получать доступ к личной переписке. При наличии административной роли администратору могут предоставляться дополнительные функции управления учётными записями и контроля работы системы.</w:t>
-      </w:r>
-    </w:p>
-    <w:p>
-      <w:pPr>
-        <w:pStyle w:val="2"/>
-      </w:pPr>
-      <w:r>
-        <w:t>Выбор состава программных и технических</w:t>
-      </w:r>
-      <w:r>
-        <w:t xml:space="preserve"> с</w:t>
-      </w:r>
-      <w:r>
-        <w:t>редств</w:t>
-      </w:r>
-    </w:p>
-    <w:p>
-      <w:pPr>
-        <w:pStyle w:val="ae"/>
-      </w:pPr>
-      <w:r>
-        <w:t>В качестве основных средств разработки выбраны язык программирования C#, платформа .NET, технология Blazor Server, интегрированная среда разработки Visual Studio 2026 и MySQL Workbench 8.0</w:t>
-      </w:r>
-      <w:r>
-        <w:t xml:space="preserve"> для проектирования и администрирования базы данных</w:t>
-      </w:r>
-      <w:r>
-        <w:t>.</w:t>
-      </w:r>
-    </w:p>
-    <w:p>
-      <w:pPr>
-        <w:pStyle w:val="ae"/>
-      </w:pPr>
-      <w:r>
-        <w:t>C#</w:t>
-      </w:r>
-      <w:r>
-        <w:t xml:space="preserve"> –</w:t>
-      </w:r>
-      <w:r>
-        <w:t xml:space="preserve"> основной язык программирования, предназначенный для реализации бизнес-логики приложения.</w:t>
-      </w:r>
-    </w:p>
-    <w:p>
-      <w:pPr>
-        <w:pStyle w:val="ae"/>
-      </w:pPr>
-      <w:r>
-        <w:lastRenderedPageBreak/>
-        <w:t xml:space="preserve">Blazor Server </w:t>
-      </w:r>
-      <w:r>
-        <w:t>–</w:t>
-      </w:r>
-      <w:r>
-        <w:t xml:space="preserve"> в</w:t>
-      </w:r>
-      <w:r>
-        <w:t xml:space="preserve">ыполнение </w:t>
-      </w:r>
-      <w:r>
-        <w:t xml:space="preserve">компонентов и обработка пользовательских </w:t>
-      </w:r>
-      <w:r>
-        <w:t>запросов</w:t>
-      </w:r>
-      <w:r>
-        <w:t xml:space="preserve"> осуществляются на сервере.</w:t>
-      </w:r>
-    </w:p>
-    <w:p>
-      <w:pPr>
-        <w:pStyle w:val="ae"/>
-      </w:pPr>
-      <w:r>
-        <w:t>SignalR</w:t>
-      </w:r>
-      <w:r>
-        <w:t xml:space="preserve"> – он</w:t>
-      </w:r>
-      <w:r>
-        <w:t xml:space="preserve"> позволяет обновлять интерфейс при поступлении новых сообщений без перезагрузки страницы</w:t>
-      </w:r>
-      <w:r>
-        <w:t>.</w:t>
-      </w:r>
-    </w:p>
-    <w:p>
-      <w:pPr>
-        <w:pStyle w:val="ae"/>
-      </w:pPr>
-      <w:r>
-        <w:t xml:space="preserve">Visual Studio 2026 </w:t>
-      </w:r>
-      <w:r>
-        <w:t>–</w:t>
+        <w:t>храни</w:t>
+      </w:r>
+      <w:r>
+        <w:t>ть</w:t>
+      </w:r>
+      <w:r>
+        <w:t xml:space="preserve"> парол</w:t>
+      </w:r>
+      <w:r>
+        <w:t>и</w:t>
+      </w:r>
+      <w:r>
+        <w:t xml:space="preserve"> в виде</w:t>
+      </w:r>
+      <w:r>
+        <w:t xml:space="preserve"> криптографических</w:t>
       </w:r>
       <w:r>
         <w:t xml:space="preserve"> </w:t>
       </w:r>
-      <w:r>
-        <w:t xml:space="preserve">среда разработки, </w:t>
-      </w:r>
-      <w:r>
-        <w:t>предоставл</w:t>
-      </w:r>
-      <w:r>
-        <w:t>яющая</w:t>
-      </w:r>
-      <w:r>
-        <w:t xml:space="preserve"> инструменты для работы с проектами .NET.</w:t>
-      </w:r>
-    </w:p>
-    <w:p>
-      <w:pPr>
-        <w:pStyle w:val="ae"/>
-      </w:pPr>
-      <w:r>
-        <w:t xml:space="preserve">MySQL Workbench 8.0 </w:t>
-      </w:r>
-      <w:r>
-        <w:t>–</w:t>
-      </w:r>
-      <w:r>
-        <w:t xml:space="preserve"> </w:t>
-      </w:r>
-      <w:r>
-        <w:t xml:space="preserve">удобный </w:t>
-      </w:r>
-      <w:r>
-        <w:t>графический инструмент для проектирования структуры базы данных и администрирования MySQL Server.</w:t>
-      </w:r>
-    </w:p>
-    <w:p>
-      <w:pPr>
-        <w:pStyle w:val="ae"/>
-      </w:pPr>
-      <w:r>
-        <w:t xml:space="preserve">Клиентская часть представляет собой веб-интерфейс, доступный через браузер. </w:t>
-      </w:r>
-      <w:r>
-        <w:t>При</w:t>
-      </w:r>
-      <w:r>
-        <w:t xml:space="preserve"> использовании Blazor Server основная логика приложения выполняется на сервере, требования к производительности клиентского устройства </w:t>
-      </w:r>
-      <w:r>
-        <w:t>достаточно низкие</w:t>
-      </w:r>
-      <w:r>
-        <w:t>.</w:t>
-      </w:r>
-    </w:p>
-    <w:p>
-      <w:pPr>
-        <w:pStyle w:val="ae"/>
-      </w:pPr>
-      <w:r>
-        <w:t>Рекомендуемые минимальные требования к клиентскому устройству:</w:t>
+      <w:proofErr w:type="spellStart"/>
+      <w:r>
+        <w:t>хэшей</w:t>
+      </w:r>
+      <w:proofErr w:type="spellEnd"/>
+      <w:r>
+        <w:t>;</w:t>
       </w:r>
     </w:p>
     <w:p>
@@ -3677,7 +3626,13 @@
         <w:ind w:left="0" w:firstLine="709"/>
       </w:pPr>
       <w:r>
-        <w:t>процессор с двумя вычислительными ядрами и частотой от 2,0 ГГц;</w:t>
+        <w:t xml:space="preserve">необходимо предусмотреть резервное копирование </w:t>
+      </w:r>
+      <w:r>
+        <w:t>БД</w:t>
+      </w:r>
+      <w:r>
+        <w:t>;</w:t>
       </w:r>
     </w:p>
     <w:p>
@@ -3693,7 +3648,396 @@
         <w:ind w:left="0" w:firstLine="709"/>
       </w:pPr>
       <w:r>
-        <w:t>оперативная память объёмом от 4 ГБ;</w:t>
+        <w:t>провер</w:t>
+      </w:r>
+      <w:r>
+        <w:t>ять</w:t>
+      </w:r>
+      <w:r>
+        <w:t xml:space="preserve"> полномочи</w:t>
+      </w:r>
+      <w:r>
+        <w:t>я</w:t>
+      </w:r>
+      <w:r>
+        <w:t xml:space="preserve"> пользователей при выполнении запросов.</w:t>
+      </w:r>
+    </w:p>
+    <w:p>
+      <w:pPr>
+        <w:pStyle w:val="2"/>
+      </w:pPr>
+      <w:r>
+        <w:t>Выбор состава программных и технических</w:t>
+      </w:r>
+      <w:r>
+        <w:t xml:space="preserve"> с</w:t>
+      </w:r>
+      <w:r>
+        <w:t>редств</w:t>
+      </w:r>
+    </w:p>
+    <w:p>
+      <w:pPr>
+        <w:pStyle w:val="ae"/>
+      </w:pPr>
+      <w:r>
+        <w:t>В качестве осн</w:t>
+      </w:r>
+      <w:r>
+        <w:t>овн</w:t>
+      </w:r>
+      <w:r>
+        <w:t>ого языка программирования</w:t>
+      </w:r>
+      <w:r>
+        <w:t xml:space="preserve"> выбран</w:t>
+      </w:r>
+      <w:r>
+        <w:t xml:space="preserve"> язык программирования C#</w:t>
+      </w:r>
+      <w:r>
+        <w:t>, потому что с помощью него реализуется бизнес-логика приложения и часть клиентского интерфейс</w:t>
+      </w:r>
+      <w:r>
+        <w:t>. Выбрана с</w:t>
+      </w:r>
+      <w:r>
+        <w:t xml:space="preserve">овременная платформа </w:t>
+      </w:r>
+      <w:r>
+        <w:lastRenderedPageBreak/>
+        <w:t>.</w:t>
+      </w:r>
+      <w:r>
+        <w:rPr>
+          <w:lang w:val="en-US"/>
+        </w:rPr>
+        <w:t>NET</w:t>
+      </w:r>
+      <w:r>
+        <w:t xml:space="preserve"> 10 </w:t>
+      </w:r>
+      <w:r>
+        <w:t xml:space="preserve">для </w:t>
+      </w:r>
+      <w:r>
+        <w:t xml:space="preserve">обеспечения </w:t>
+      </w:r>
+      <w:r>
+        <w:t>лучшей производительности</w:t>
+      </w:r>
+      <w:r>
+        <w:t xml:space="preserve"> и </w:t>
+      </w:r>
+      <w:r>
+        <w:t xml:space="preserve">интегрированная среда разработки </w:t>
+      </w:r>
+      <w:proofErr w:type="spellStart"/>
+      <w:r>
+        <w:t>Visual</w:t>
+      </w:r>
+      <w:proofErr w:type="spellEnd"/>
+      <w:r>
+        <w:t xml:space="preserve"> </w:t>
+      </w:r>
+      <w:proofErr w:type="spellStart"/>
+      <w:r>
+        <w:t>Studio</w:t>
+      </w:r>
+      <w:proofErr w:type="spellEnd"/>
+      <w:r>
+        <w:t xml:space="preserve"> 2026, предоставляющая инструменты для работы с проектами .NET</w:t>
+      </w:r>
+      <w:r>
+        <w:t>.</w:t>
+      </w:r>
+    </w:p>
+    <w:p>
+      <w:pPr>
+        <w:pStyle w:val="ae"/>
+      </w:pPr>
+      <w:r>
+        <w:t>Выбрана т</w:t>
+      </w:r>
+      <w:r>
+        <w:t xml:space="preserve">ехнология </w:t>
+      </w:r>
+      <w:proofErr w:type="spellStart"/>
+      <w:r>
+        <w:rPr>
+          <w:lang w:val="en-US"/>
+        </w:rPr>
+        <w:t>Blazor</w:t>
+      </w:r>
+      <w:proofErr w:type="spellEnd"/>
+      <w:r>
+        <w:t xml:space="preserve"> </w:t>
+      </w:r>
+      <w:r>
+        <w:rPr>
+          <w:lang w:val="en-US"/>
+        </w:rPr>
+        <w:t>Server</w:t>
+      </w:r>
+      <w:r>
+        <w:t xml:space="preserve">, потому что </w:t>
+      </w:r>
+      <w:r>
+        <w:t>в</w:t>
+      </w:r>
+      <w:r>
+        <w:t>ыполнение</w:t>
+      </w:r>
+      <w:r>
+        <w:t xml:space="preserve"> </w:t>
+      </w:r>
+      <w:r>
+        <w:t>компонентов и обработка</w:t>
+      </w:r>
+      <w:r>
+        <w:t xml:space="preserve"> пользовательских </w:t>
+      </w:r>
+      <w:r>
+        <w:t>запросов</w:t>
+      </w:r>
+      <w:r>
+        <w:t xml:space="preserve"> осуществляе</w:t>
+      </w:r>
+      <w:r>
+        <w:t>тся на сервере</w:t>
+      </w:r>
+      <w:r>
+        <w:t>.</w:t>
+      </w:r>
+    </w:p>
+    <w:p>
+      <w:pPr>
+        <w:pStyle w:val="ae"/>
+      </w:pPr>
+      <w:r>
+        <w:t>Для реализации общения между пользователями выбрана б</w:t>
+      </w:r>
+      <w:r>
+        <w:t xml:space="preserve">иблиотека </w:t>
+      </w:r>
+      <w:proofErr w:type="spellStart"/>
+      <w:r>
+        <w:rPr>
+          <w:lang w:val="en-US"/>
+        </w:rPr>
+        <w:t>SignalR</w:t>
+      </w:r>
+      <w:proofErr w:type="spellEnd"/>
+      <w:r>
+        <w:t xml:space="preserve">, поскольку при реализации она позволяет </w:t>
+      </w:r>
+      <w:r>
+        <w:t xml:space="preserve">обновлять </w:t>
+      </w:r>
+      <w:r>
+        <w:t xml:space="preserve">пользовательский </w:t>
+      </w:r>
+      <w:r>
+        <w:t>интерфейс при поступлении новых соо</w:t>
+      </w:r>
+      <w:r>
+        <w:t>бщений без перезагрузки страницы</w:t>
+      </w:r>
+      <w:r>
+        <w:t>.</w:t>
+      </w:r>
+    </w:p>
+    <w:p>
+      <w:pPr>
+        <w:pStyle w:val="ae"/>
+      </w:pPr>
+      <w:r>
+        <w:t xml:space="preserve">Выбран </w:t>
+      </w:r>
+      <w:proofErr w:type="spellStart"/>
+      <w:r>
+        <w:t>фреймворк</w:t>
+      </w:r>
+      <w:proofErr w:type="spellEnd"/>
+      <w:r>
+        <w:t xml:space="preserve"> </w:t>
+      </w:r>
+      <w:r>
+        <w:rPr>
+          <w:lang w:val="en-US"/>
+        </w:rPr>
+        <w:t>Entity</w:t>
+      </w:r>
+      <w:r>
+        <w:t xml:space="preserve"> </w:t>
+      </w:r>
+      <w:r>
+        <w:rPr>
+          <w:lang w:val="en-US"/>
+        </w:rPr>
+        <w:t>Framework</w:t>
+      </w:r>
+      <w:r>
+        <w:t xml:space="preserve"> </w:t>
+      </w:r>
+      <w:r>
+        <w:rPr>
+          <w:lang w:val="en-US"/>
+        </w:rPr>
+        <w:t>Core</w:t>
+      </w:r>
+      <w:r>
+        <w:t xml:space="preserve"> </w:t>
+      </w:r>
+      <w:r>
+        <w:t>для работы с базами данных</w:t>
+      </w:r>
+      <w:r>
+        <w:t xml:space="preserve"> с помощью объектов </w:t>
+      </w:r>
+      <w:proofErr w:type="gramStart"/>
+      <w:r>
+        <w:rPr>
+          <w:lang w:val="en-US"/>
+        </w:rPr>
+        <w:t>C</w:t>
+      </w:r>
+      <w:r>
+        <w:t>#</w:t>
+      </w:r>
+      <w:r>
+        <w:t>,</w:t>
+      </w:r>
+      <w:r>
+        <w:t xml:space="preserve"> </w:t>
+      </w:r>
+      <w:r>
+        <w:t xml:space="preserve"> и</w:t>
+      </w:r>
+      <w:proofErr w:type="gramEnd"/>
+      <w:r>
+        <w:t xml:space="preserve"> </w:t>
+      </w:r>
+      <w:proofErr w:type="spellStart"/>
+      <w:r>
+        <w:t>MySQL</w:t>
+      </w:r>
+      <w:proofErr w:type="spellEnd"/>
+      <w:r>
+        <w:t xml:space="preserve"> </w:t>
+      </w:r>
+      <w:proofErr w:type="spellStart"/>
+      <w:r>
+        <w:t>Workbench</w:t>
+      </w:r>
+      <w:proofErr w:type="spellEnd"/>
+      <w:r>
+        <w:t xml:space="preserve"> 8.0</w:t>
+      </w:r>
+      <w:r>
+        <w:t xml:space="preserve"> для проектирования</w:t>
+      </w:r>
+      <w:r>
+        <w:t xml:space="preserve"> </w:t>
+      </w:r>
+      <w:r>
+        <w:t xml:space="preserve">структуры и администрирования БД и </w:t>
+      </w:r>
+      <w:r>
+        <w:rPr>
+          <w:lang w:val="en-US"/>
+        </w:rPr>
+        <w:t>MySQL</w:t>
+      </w:r>
+      <w:r>
+        <w:t xml:space="preserve"> </w:t>
+      </w:r>
+      <w:r>
+        <w:rPr>
+          <w:lang w:val="en-US"/>
+        </w:rPr>
+        <w:t>Server</w:t>
+      </w:r>
+      <w:r>
+        <w:t>.</w:t>
+      </w:r>
+    </w:p>
+    <w:p>
+      <w:pPr>
+        <w:pStyle w:val="ae"/>
+      </w:pPr>
+      <w:r>
+        <w:t>Клиентская часть</w:t>
+      </w:r>
+      <w:r>
+        <w:t xml:space="preserve"> </w:t>
+      </w:r>
+      <w:r>
+        <w:t>будет</w:t>
+      </w:r>
+      <w:r>
+        <w:t xml:space="preserve"> </w:t>
+      </w:r>
+      <w:r>
+        <w:t>представля</w:t>
+      </w:r>
+      <w:r>
+        <w:t>т</w:t>
+      </w:r>
+      <w:r>
+        <w:t>ь</w:t>
+      </w:r>
+      <w:r>
+        <w:t xml:space="preserve"> собой веб-интерфейс, доступный через браузер. </w:t>
+      </w:r>
+      <w:r>
+        <w:t>При</w:t>
+      </w:r>
+      <w:r>
+        <w:t xml:space="preserve"> использовании </w:t>
+      </w:r>
+      <w:proofErr w:type="spellStart"/>
+      <w:r>
+        <w:t>Blazor</w:t>
+      </w:r>
+      <w:proofErr w:type="spellEnd"/>
+      <w:r>
+        <w:t xml:space="preserve"> </w:t>
+      </w:r>
+      <w:proofErr w:type="spellStart"/>
+      <w:r>
+        <w:t>Server</w:t>
+      </w:r>
+      <w:proofErr w:type="spellEnd"/>
+      <w:r>
+        <w:t xml:space="preserve"> основная логика приложения выполняется на сервере, требования к производительности клиентского устройства </w:t>
+      </w:r>
+      <w:r>
+        <w:t>достаточно низкие</w:t>
+      </w:r>
+      <w:r>
+        <w:t>.</w:t>
+      </w:r>
+    </w:p>
+    <w:p>
+      <w:pPr>
+        <w:pStyle w:val="ae"/>
+      </w:pPr>
+      <w:r>
+        <w:t>К</w:t>
+      </w:r>
+      <w:r>
+        <w:t xml:space="preserve"> клиентскому устройству</w:t>
+      </w:r>
+      <w:r>
+        <w:t xml:space="preserve"> </w:t>
+      </w:r>
+      <w:r>
+        <w:t>предъявляются следующие требования</w:t>
+      </w:r>
+      <w:r>
+        <w:t>:</w:t>
       </w:r>
     </w:p>
     <w:p>
@@ -3709,7 +4053,13 @@
         <w:ind w:left="0" w:firstLine="709"/>
       </w:pPr>
       <w:r>
-        <w:t>современный веб-браузер с поддержкой JavaScript, HTML5, CSS и WebSocket;</w:t>
+        <w:t xml:space="preserve">процессор с </w:t>
+      </w:r>
+      <w:r>
+        <w:t>2</w:t>
+      </w:r>
+      <w:r>
+        <w:t xml:space="preserve"> вычислительными ядрами и частотой от 2,0 ГГц;</w:t>
       </w:r>
     </w:p>
     <w:p>
@@ -3725,38 +4075,7 @@
         <w:ind w:left="0" w:firstLine="709"/>
       </w:pPr>
       <w:r>
-        <w:t>стабильное подключение к Интернету или локальной сети.</w:t>
-      </w:r>
-    </w:p>
-    <w:p>
-      <w:pPr>
-        <w:pStyle w:val="ae"/>
-        <w:tabs>
-          <w:tab w:val="left" w:pos="993"/>
-        </w:tabs>
-      </w:pPr>
-      <w:r>
-        <w:t>Серверная часть выполняет основную логику приложения</w:t>
-      </w:r>
-      <w:r>
-        <w:t>.</w:t>
-      </w:r>
-    </w:p>
-    <w:p>
-      <w:pPr>
-        <w:pStyle w:val="ae"/>
-        <w:tabs>
-          <w:tab w:val="left" w:pos="993"/>
-        </w:tabs>
-      </w:pPr>
-      <w:r>
-        <w:t xml:space="preserve">Рекомендуемые минимальные требования к </w:t>
-      </w:r>
-      <w:r>
-        <w:t>серверному</w:t>
-      </w:r>
-      <w:r>
-        <w:t xml:space="preserve"> устройству:</w:t>
+        <w:t>оперативная память объёмом от 4 ГБ;</w:t>
       </w:r>
     </w:p>
     <w:p>
@@ -3772,7 +4091,23 @@
         <w:ind w:left="0" w:firstLine="709"/>
       </w:pPr>
       <w:r>
-        <w:t>процессор с четырьмя вычислительными ядрами и частотой от 2,5 ГГц;</w:t>
+        <w:t xml:space="preserve">современный веб-браузер с поддержкой </w:t>
+      </w:r>
+      <w:proofErr w:type="spellStart"/>
+      <w:r>
+        <w:t>JavaScript</w:t>
+      </w:r>
+      <w:proofErr w:type="spellEnd"/>
+      <w:r>
+        <w:t xml:space="preserve">, HTML5, CSS и </w:t>
+      </w:r>
+      <w:proofErr w:type="spellStart"/>
+      <w:r>
+        <w:t>WebSocket</w:t>
+      </w:r>
+      <w:proofErr w:type="spellEnd"/>
+      <w:r>
+        <w:t>;</w:t>
       </w:r>
     </w:p>
     <w:p>
@@ -3788,7 +4123,27 @@
         <w:ind w:left="0" w:firstLine="709"/>
       </w:pPr>
       <w:r>
-        <w:t>оперативная память объёмом от 8 ГБ;</w:t>
+        <w:t>стабильное подключение к Интернету или локальной сети.</w:t>
+      </w:r>
+    </w:p>
+    <w:p>
+      <w:pPr>
+        <w:pStyle w:val="ae"/>
+        <w:tabs>
+          <w:tab w:val="left" w:pos="993"/>
+        </w:tabs>
+      </w:pPr>
+      <w:r>
+        <w:t>К</w:t>
+      </w:r>
+      <w:r>
+        <w:t xml:space="preserve"> серверному устройству</w:t>
+      </w:r>
+      <w:r>
+        <w:t xml:space="preserve"> предъявляются следующие </w:t>
+      </w:r>
+      <w:r>
+        <w:t>требования:</w:t>
       </w:r>
     </w:p>
     <w:p>
@@ -3804,7 +4159,13 @@
         <w:ind w:left="0" w:firstLine="709"/>
       </w:pPr>
       <w:r>
-        <w:t>SSD-накопитель объёмом от 100 ГБ;</w:t>
+        <w:t xml:space="preserve">процессор с </w:t>
+      </w:r>
+      <w:r>
+        <w:t>4</w:t>
+      </w:r>
+      <w:r>
+        <w:t xml:space="preserve"> вычислительными ядрами и частотой от 2,5 ГГц;</w:t>
       </w:r>
     </w:p>
     <w:p>
@@ -3820,10 +4181,7 @@
         <w:ind w:left="0" w:firstLine="709"/>
       </w:pPr>
       <w:r>
-        <w:t xml:space="preserve">ОС </w:t>
-      </w:r>
-      <w:r>
-        <w:t>Windows с поддержкой используемой версии .NET;</w:t>
+        <w:t>оперативная память объёмом от 8 ГБ;</w:t>
       </w:r>
     </w:p>
     <w:p>
@@ -3839,7 +4197,7 @@
         <w:ind w:left="0" w:firstLine="709"/>
       </w:pPr>
       <w:r>
-        <w:t>установленная среда выполнения .NET соответствующей версии;</w:t>
+        <w:t>SSD-накопитель объёмом от 100 ГБ;</w:t>
       </w:r>
     </w:p>
     <w:p>
@@ -3855,7 +4213,27 @@
         <w:ind w:left="0" w:firstLine="709"/>
       </w:pPr>
       <w:r>
-        <w:t>установленный и настроенный MySQL Server;</w:t>
+        <w:t xml:space="preserve">ОС </w:t>
+      </w:r>
+      <w:proofErr w:type="spellStart"/>
+      <w:r>
+        <w:t>Windows</w:t>
+      </w:r>
+      <w:proofErr w:type="spellEnd"/>
+      <w:r>
+        <w:t xml:space="preserve"> </w:t>
+      </w:r>
+      <w:r>
+        <w:t xml:space="preserve">10 </w:t>
+      </w:r>
+      <w:r>
+        <w:t>с поддержкой версии .NET</w:t>
+      </w:r>
+      <w:r>
+        <w:t xml:space="preserve"> 10</w:t>
+      </w:r>
+      <w:r>
+        <w:t>;</w:t>
       </w:r>
     </w:p>
     <w:p>
@@ -3871,7 +4249,70 @@
         <w:ind w:left="0" w:firstLine="709"/>
       </w:pPr>
       <w:r>
-        <w:t>сетевое подключение со скоростью не менее 100 Мбит/с.</w:t>
+        <w:t xml:space="preserve">среда выполнения .NET </w:t>
+      </w:r>
+      <w:r>
+        <w:t>10</w:t>
+      </w:r>
+      <w:r>
+        <w:t>;</w:t>
+      </w:r>
+    </w:p>
+    <w:p>
+      <w:pPr>
+        <w:pStyle w:val="ae"/>
+        <w:numPr>
+          <w:ilvl w:val="0"/>
+          <w:numId w:val="8"/>
+        </w:numPr>
+        <w:tabs>
+          <w:tab w:val="left" w:pos="993"/>
+        </w:tabs>
+        <w:ind w:left="0" w:firstLine="709"/>
+      </w:pPr>
+      <w:proofErr w:type="spellStart"/>
+      <w:r>
+        <w:t>MySQL</w:t>
+      </w:r>
+      <w:proofErr w:type="spellEnd"/>
+      <w:r>
+        <w:t xml:space="preserve"> </w:t>
+      </w:r>
+      <w:proofErr w:type="spellStart"/>
+      <w:r>
+        <w:t>Server</w:t>
+      </w:r>
+      <w:proofErr w:type="spellEnd"/>
+      <w:r>
+        <w:t xml:space="preserve"> 8.0.46</w:t>
+      </w:r>
+      <w:r>
+        <w:t xml:space="preserve"> LTS</w:t>
+      </w:r>
+      <w:r>
+        <w:t>;</w:t>
+      </w:r>
+    </w:p>
+    <w:p>
+      <w:pPr>
+        <w:pStyle w:val="ae"/>
+        <w:numPr>
+          <w:ilvl w:val="0"/>
+          <w:numId w:val="8"/>
+        </w:numPr>
+        <w:tabs>
+          <w:tab w:val="left" w:pos="993"/>
+        </w:tabs>
+        <w:ind w:left="0" w:firstLine="709"/>
+      </w:pPr>
+      <w:r>
+        <w:t xml:space="preserve">сетевое подключение со </w:t>
+      </w:r>
+      <w:r>
+        <w:t>скоростью не менее 10</w:t>
+      </w:r>
+      <w:r>
+        <w:t>0 Мбит/с.</w:t>
       </w:r>
     </w:p>
     <w:sectPr>
@@ -3887,7 +4328,7 @@
 </file>
 
 <file path=word/endnotes.xml><?xml version="1.0" encoding="utf-8"?>
-<w:endnotes xmlns:wpc="http://schemas.microsoft.com/office/word/2010/wordprocessingCanvas" xmlns:cx="http://schemas.microsoft.com/office/drawing/2014/chartex" xmlns:cx1="http://schemas.microsoft.com/office/drawing/2015/9/8/chartex" xmlns:cx2="http://schemas.microsoft.com/office/drawing/2015/10/21/chartex" xmlns:cx3="http://schemas.microsoft.com/office/drawing/2016/5/9/chartex" xmlns:cx4="http://schemas.microsoft.com/office/drawing/2016/5/10/chartex" xmlns:cx5="http://schemas.microsoft.com/office/drawing/2016/5/11/chartex" xmlns:cx6="http://schemas.microsoft.com/office/drawing/2016/5/12/chartex" xmlns:cx7="http://schemas.microsoft.com/office/drawing/2016/5/13/chartex" xmlns:cx8="http://schemas.microsoft.com/office/drawing/2016/5/14/chartex" xmlns:mc="http://schemas.openxmlformats.org/markup-compatibility/2006" xmlns:aink="http://schemas.microsoft.com/office/drawing/2016/ink" xmlns:am3d="http://schemas.microsoft.com/office/drawing/2017/model3d" xmlns:o="urn:schemas-microsoft-com:office:office" xmlns:r="http://schemas.openxmlformats.org/officeDocument/2006/relationships" xmlns:m="http://schemas.openxmlformats.org/officeDocument/2006/math" xmlns:v="urn:schemas-microsoft-com:vml" xmlns:wp14="http://schemas.microsoft.com/office/word/2010/wordprocessingDrawing" xmlns:wp="http://schemas.openxmlformats.org/drawingml/2006/wordprocessingDrawing" xmlns:w10="urn:schemas-microsoft-com:office:word" xmlns:w="http://schemas.openxmlformats.org/wordprocessingml/2006/main" xmlns:w14="http://schemas.microsoft.com/office/word/2010/wordml" xmlns:w15="http://schemas.microsoft.com/office/word/2012/wordml" xmlns:w16cex="http://schemas.microsoft.com/office/word/2018/wordml/cex" xmlns:w16cid="http://schemas.microsoft.com/office/word/2016/wordml/cid" xmlns:w16="http://schemas.microsoft.com/office/word/2018/wordml" xmlns:w16sdtdh="http://schemas.microsoft.com/office/word/2020/wordml/sdtdatahash" xmlns:w16se="http://schemas.microsoft.com/office/word/2015/wordml/symex" xmlns:wpg="http://schemas.microsoft.com/office/word/2010/wordprocessingGroup" xmlns:wpi="http://schemas.microsoft.com/office/word/2010/wordprocessingInk" xmlns:wne="http://schemas.microsoft.com/office/word/2006/wordml" xmlns:wps="http://schemas.microsoft.com/office/word/2010/wordprocessingShape" mc:Ignorable="w14 w15 w16se w16cid w16 w16cex w16sdtdh wp14">
+<w:endnotes xmlns:wpc="http://schemas.microsoft.com/office/word/2010/wordprocessingCanvas" xmlns:cx="http://schemas.microsoft.com/office/drawing/2014/chartex" xmlns:mc="http://schemas.openxmlformats.org/markup-compatibility/2006" xmlns:o="urn:schemas-microsoft-com:office:office" xmlns:r="http://schemas.openxmlformats.org/officeDocument/2006/relationships" xmlns:m="http://schemas.openxmlformats.org/officeDocument/2006/math" xmlns:v="urn:schemas-microsoft-com:vml" xmlns:wp14="http://schemas.microsoft.com/office/word/2010/wordprocessingDrawing" xmlns:wp="http://schemas.openxmlformats.org/drawingml/2006/wordprocessingDrawing" xmlns:w10="urn:schemas-microsoft-com:office:word" xmlns:w="http://schemas.openxmlformats.org/wordprocessingml/2006/main" xmlns:w14="http://schemas.microsoft.com/office/word/2010/wordml" xmlns:w15="http://schemas.microsoft.com/office/word/2012/wordml" xmlns:w16se="http://schemas.microsoft.com/office/word/2015/wordml/symex" xmlns:wpg="http://schemas.microsoft.com/office/word/2010/wordprocessingGroup" xmlns:wpi="http://schemas.microsoft.com/office/word/2010/wordprocessingInk" xmlns:wne="http://schemas.microsoft.com/office/word/2006/wordml" xmlns:wps="http://schemas.microsoft.com/office/word/2010/wordprocessingShape" mc:Ignorable="w14 w15 w16se wp14">
   <w:endnote w:type="separator" w:id="-1">
     <w:p>
       <w:r>
@@ -3906,7 +4347,7 @@
 </file>
 
 <file path=word/footer1.xml><?xml version="1.0" encoding="utf-8"?>
-<w:ftr xmlns:wpc="http://schemas.microsoft.com/office/word/2010/wordprocessingCanvas" xmlns:cx="http://schemas.microsoft.com/office/drawing/2014/chartex" xmlns:cx1="http://schemas.microsoft.com/office/drawing/2015/9/8/chartex" xmlns:cx2="http://schemas.microsoft.com/office/drawing/2015/10/21/chartex" xmlns:cx3="http://schemas.microsoft.com/office/drawing/2016/5/9/chartex" xmlns:cx4="http://schemas.microsoft.com/office/drawing/2016/5/10/chartex" xmlns:cx5="http://schemas.microsoft.com/office/drawing/2016/5/11/chartex" xmlns:cx6="http://schemas.microsoft.com/office/drawing/2016/5/12/chartex" xmlns:cx7="http://schemas.microsoft.com/office/drawing/2016/5/13/chartex" xmlns:cx8="http://schemas.microsoft.com/office/drawing/2016/5/14/chartex" xmlns:mc="http://schemas.openxmlformats.org/markup-compatibility/2006" xmlns:aink="http://schemas.microsoft.com/office/drawing/2016/ink" xmlns:am3d="http://schemas.microsoft.com/office/drawing/2017/model3d" xmlns:o="urn:schemas-microsoft-com:office:office" xmlns:r="http://schemas.openxmlformats.org/officeDocument/2006/relationships" xmlns:m="http://schemas.openxmlformats.org/officeDocument/2006/math" xmlns:v="urn:schemas-microsoft-com:vml" xmlns:wp14="http://schemas.microsoft.com/office/word/2010/wordprocessingDrawing" xmlns:wp="http://schemas.openxmlformats.org/drawingml/2006/wordprocessingDrawing" xmlns:w10="urn:schemas-microsoft-com:office:word" xmlns:w="http://schemas.openxmlformats.org/wordprocessingml/2006/main" xmlns:w14="http://schemas.microsoft.com/office/word/2010/wordml" xmlns:w15="http://schemas.microsoft.com/office/word/2012/wordml" xmlns:w16cex="http://schemas.microsoft.com/office/word/2018/wordml/cex" xmlns:w16cid="http://schemas.microsoft.com/office/word/2016/wordml/cid" xmlns:w16="http://schemas.microsoft.com/office/word/2018/wordml" xmlns:w16sdtdh="http://schemas.microsoft.com/office/word/2020/wordml/sdtdatahash" xmlns:w16se="http://schemas.microsoft.com/office/word/2015/wordml/symex" xmlns:wpg="http://schemas.microsoft.com/office/word/2010/wordprocessingGroup" xmlns:wpi="http://schemas.microsoft.com/office/word/2010/wordprocessingInk" xmlns:wne="http://schemas.microsoft.com/office/word/2006/wordml" xmlns:wps="http://schemas.microsoft.com/office/word/2010/wordprocessingShape" mc:Ignorable="w14 w15 w16se w16cid w16 w16cex w16sdtdh wp14">
+<w:ftr xmlns:wpc="http://schemas.microsoft.com/office/word/2010/wordprocessingCanvas" xmlns:cx="http://schemas.microsoft.com/office/drawing/2014/chartex" xmlns:mc="http://schemas.openxmlformats.org/markup-compatibility/2006" xmlns:o="urn:schemas-microsoft-com:office:office" xmlns:r="http://schemas.openxmlformats.org/officeDocument/2006/relationships" xmlns:m="http://schemas.openxmlformats.org/officeDocument/2006/math" xmlns:v="urn:schemas-microsoft-com:vml" xmlns:wp14="http://schemas.microsoft.com/office/word/2010/wordprocessingDrawing" xmlns:wp="http://schemas.openxmlformats.org/drawingml/2006/wordprocessingDrawing" xmlns:w10="urn:schemas-microsoft-com:office:word" xmlns:w="http://schemas.openxmlformats.org/wordprocessingml/2006/main" xmlns:w14="http://schemas.microsoft.com/office/word/2010/wordml" xmlns:w15="http://schemas.microsoft.com/office/word/2012/wordml" xmlns:w16se="http://schemas.microsoft.com/office/word/2015/wordml/symex" xmlns:wpg="http://schemas.microsoft.com/office/word/2010/wordprocessingGroup" xmlns:wpi="http://schemas.microsoft.com/office/word/2010/wordprocessingInk" xmlns:wne="http://schemas.microsoft.com/office/word/2006/wordml" xmlns:wps="http://schemas.microsoft.com/office/word/2010/wordprocessingShape" mc:Ignorable="w14 w15 w16se wp14">
   <w:sdt>
     <w:sdtPr>
       <w:id w:val="-425809225"/>
@@ -3932,7 +4373,10 @@
           <w:fldChar w:fldCharType="separate"/>
         </w:r>
         <w:r>
-          <w:t>2</w:t>
+          <w:rPr>
+            <w:noProof/>
+          </w:rPr>
+          <w:t>7</w:t>
         </w:r>
         <w:r>
           <w:fldChar w:fldCharType="end"/>
@@ -3944,7 +4388,7 @@
 </file>
 
 <file path=word/footnotes.xml><?xml version="1.0" encoding="utf-8"?>
-<w:footnotes xmlns:wpc="http://schemas.microsoft.com/office/word/2010/wordprocessingCanvas" xmlns:cx="http://schemas.microsoft.com/office/drawing/2014/chartex" xmlns:cx1="http://schemas.microsoft.com/office/drawing/2015/9/8/chartex" xmlns:cx2="http://schemas.microsoft.com/office/drawing/2015/10/21/chartex" xmlns:cx3="http://schemas.microsoft.com/office/drawing/2016/5/9/chartex" xmlns:cx4="http://schemas.microsoft.com/office/drawing/2016/5/10/chartex" xmlns:cx5="http://schemas.microsoft.com/office/drawing/2016/5/11/chartex" xmlns:cx6="http://schemas.microsoft.com/office/drawing/2016/5/12/chartex" xmlns:cx7="http://schemas.microsoft.com/office/drawing/2016/5/13/chartex" xmlns:cx8="http://schemas.microsoft.com/office/drawing/2016/5/14/chartex" xmlns:mc="http://schemas.openxmlformats.org/markup-compatibility/2006" xmlns:aink="http://schemas.microsoft.com/office/drawing/2016/ink" xmlns:am3d="http://schemas.microsoft.com/office/drawing/2017/model3d" xmlns:o="urn:schemas-microsoft-com:office:office" xmlns:r="http://schemas.openxmlformats.org/officeDocument/2006/relationships" xmlns:m="http://schemas.openxmlformats.org/officeDocument/2006/math" xmlns:v="urn:schemas-microsoft-com:vml" xmlns:wp14="http://schemas.microsoft.com/office/word/2010/wordprocessingDrawing" xmlns:wp="http://schemas.openxmlformats.org/drawingml/2006/wordprocessingDrawing" xmlns:w10="urn:schemas-microsoft-com:office:word" xmlns:w="http://schemas.openxmlformats.org/wordprocessingml/2006/main" xmlns:w14="http://schemas.microsoft.com/office/word/2010/wordml" xmlns:w15="http://schemas.microsoft.com/office/word/2012/wordml" xmlns:w16cex="http://schemas.microsoft.com/office/word/2018/wordml/cex" xmlns:w16cid="http://schemas.microsoft.com/office/word/2016/wordml/cid" xmlns:w16="http://schemas.microsoft.com/office/word/2018/wordml" xmlns:w16sdtdh="http://schemas.microsoft.com/office/word/2020/wordml/sdtdatahash" xmlns:w16se="http://schemas.microsoft.com/office/word/2015/wordml/symex" xmlns:wpg="http://schemas.microsoft.com/office/word/2010/wordprocessingGroup" xmlns:wpi="http://schemas.microsoft.com/office/word/2010/wordprocessingInk" xmlns:wne="http://schemas.microsoft.com/office/word/2006/wordml" xmlns:wps="http://schemas.microsoft.com/office/word/2010/wordprocessingShape" mc:Ignorable="w14 w15 w16se w16cid w16 w16cex w16sdtdh wp14">
+<w:footnotes xmlns:wpc="http://schemas.microsoft.com/office/word/2010/wordprocessingCanvas" xmlns:cx="http://schemas.microsoft.com/office/drawing/2014/chartex" xmlns:mc="http://schemas.openxmlformats.org/markup-compatibility/2006" xmlns:o="urn:schemas-microsoft-com:office:office" xmlns:r="http://schemas.openxmlformats.org/officeDocument/2006/relationships" xmlns:m="http://schemas.openxmlformats.org/officeDocument/2006/math" xmlns:v="urn:schemas-microsoft-com:vml" xmlns:wp14="http://schemas.microsoft.com/office/word/2010/wordprocessingDrawing" xmlns:wp="http://schemas.openxmlformats.org/drawingml/2006/wordprocessingDrawing" xmlns:w10="urn:schemas-microsoft-com:office:word" xmlns:w="http://schemas.openxmlformats.org/wordprocessingml/2006/main" xmlns:w14="http://schemas.microsoft.com/office/word/2010/wordml" xmlns:w15="http://schemas.microsoft.com/office/word/2012/wordml" xmlns:w16se="http://schemas.microsoft.com/office/word/2015/wordml/symex" xmlns:wpg="http://schemas.microsoft.com/office/word/2010/wordprocessingGroup" xmlns:wpi="http://schemas.microsoft.com/office/word/2010/wordprocessingInk" xmlns:wne="http://schemas.microsoft.com/office/word/2006/wordml" xmlns:wps="http://schemas.microsoft.com/office/word/2010/wordprocessingShape" mc:Ignorable="w14 w15 w16se wp14">
   <w:footnote w:type="separator" w:id="-1">
     <w:p>
       <w:r>
@@ -3963,7 +4407,7 @@
 </file>
 
 <file path=word/numbering.xml><?xml version="1.0" encoding="utf-8"?>
-<w:numbering xmlns:wpc="http://schemas.microsoft.com/office/word/2010/wordprocessingCanvas" xmlns:cx="http://schemas.microsoft.com/office/drawing/2014/chartex" xmlns:cx1="http://schemas.microsoft.com/office/drawing/2015/9/8/chartex" xmlns:cx2="http://schemas.microsoft.com/office/drawing/2015/10/21/chartex" xmlns:cx3="http://schemas.microsoft.com/office/drawing/2016/5/9/chartex" xmlns:cx4="http://schemas.microsoft.com/office/drawing/2016/5/10/chartex" xmlns:cx5="http://schemas.microsoft.com/office/drawing/2016/5/11/chartex" xmlns:cx6="http://schemas.microsoft.com/office/drawing/2016/5/12/chartex" xmlns:cx7="http://schemas.microsoft.com/office/drawing/2016/5/13/chartex" xmlns:cx8="http://schemas.microsoft.com/office/drawing/2016/5/14/chartex" xmlns:mc="http://schemas.openxmlformats.org/markup-compatibility/2006" xmlns:aink="http://schemas.microsoft.com/office/drawing/2016/ink" xmlns:am3d="http://schemas.microsoft.com/office/drawing/2017/model3d" xmlns:o="urn:schemas-microsoft-com:office:office" xmlns:r="http://schemas.openxmlformats.org/officeDocument/2006/relationships" xmlns:m="http://schemas.openxmlformats.org/officeDocument/2006/math" xmlns:v="urn:schemas-microsoft-com:vml" xmlns:wp14="http://schemas.microsoft.com/office/word/2010/wordprocessingDrawing" xmlns:wp="http://schemas.openxmlformats.org/drawingml/2006/wordprocessingDrawing" xmlns:w10="urn:schemas-microsoft-com:office:word" xmlns:w="http://schemas.openxmlformats.org/wordprocessingml/2006/main" xmlns:w14="http://schemas.microsoft.com/office/word/2010/wordml" xmlns:w15="http://schemas.microsoft.com/office/word/2012/wordml" xmlns:w16cex="http://schemas.microsoft.com/office/word/2018/wordml/cex" xmlns:w16cid="http://schemas.microsoft.com/office/word/2016/wordml/cid" xmlns:w16="http://schemas.microsoft.com/office/word/2018/wordml" xmlns:w16sdtdh="http://schemas.microsoft.com/office/word/2020/wordml/sdtdatahash" xmlns:w16se="http://schemas.microsoft.com/office/word/2015/wordml/symex" xmlns:wpg="http://schemas.microsoft.com/office/word/2010/wordprocessingGroup" xmlns:wpi="http://schemas.microsoft.com/office/word/2010/wordprocessingInk" xmlns:wne="http://schemas.microsoft.com/office/word/2006/wordml" xmlns:wps="http://schemas.microsoft.com/office/word/2010/wordprocessingShape" mc:Ignorable="w14 w15 w16se w16cid w16 w16cex w16sdtdh wp14">
+<w:numbering xmlns:wpc="http://schemas.microsoft.com/office/word/2010/wordprocessingCanvas" xmlns:cx="http://schemas.microsoft.com/office/drawing/2014/chartex" xmlns:mc="http://schemas.openxmlformats.org/markup-compatibility/2006" xmlns:o="urn:schemas-microsoft-com:office:office" xmlns:r="http://schemas.openxmlformats.org/officeDocument/2006/relationships" xmlns:m="http://schemas.openxmlformats.org/officeDocument/2006/math" xmlns:v="urn:schemas-microsoft-com:vml" xmlns:wp14="http://schemas.microsoft.com/office/word/2010/wordprocessingDrawing" xmlns:wp="http://schemas.openxmlformats.org/drawingml/2006/wordprocessingDrawing" xmlns:w10="urn:schemas-microsoft-com:office:word" xmlns:w="http://schemas.openxmlformats.org/wordprocessingml/2006/main" xmlns:w14="http://schemas.microsoft.com/office/word/2010/wordml" xmlns:w15="http://schemas.microsoft.com/office/word/2012/wordml" xmlns:w16se="http://schemas.microsoft.com/office/word/2015/wordml/symex" xmlns:wpg="http://schemas.microsoft.com/office/word/2010/wordprocessingGroup" xmlns:wpi="http://schemas.microsoft.com/office/word/2010/wordprocessingInk" xmlns:wne="http://schemas.microsoft.com/office/word/2006/wordml" xmlns:wps="http://schemas.microsoft.com/office/word/2010/wordprocessingShape" mc:Ignorable="w14 w15 w16se wp14">
   <w:abstractNum w:abstractNumId="0" w15:restartNumberingAfterBreak="0">
     <w:nsid w:val="04EF6F10"/>
     <w:multiLevelType w:val="hybridMultilevel"/>
@@ -5370,7 +5814,7 @@
 </file>
 
 <file path=word/styles.xml><?xml version="1.0" encoding="utf-8"?>
-<w:styles xmlns:mc="http://schemas.openxmlformats.org/markup-compatibility/2006" xmlns:r="http://schemas.openxmlformats.org/officeDocument/2006/relationships" xmlns:w="http://schemas.openxmlformats.org/wordprocessingml/2006/main" xmlns:w14="http://schemas.microsoft.com/office/word/2010/wordml" xmlns:w15="http://schemas.microsoft.com/office/word/2012/wordml" xmlns:w16cex="http://schemas.microsoft.com/office/word/2018/wordml/cex" xmlns:w16cid="http://schemas.microsoft.com/office/word/2016/wordml/cid" xmlns:w16="http://schemas.microsoft.com/office/word/2018/wordml" xmlns:w16sdtdh="http://schemas.microsoft.com/office/word/2020/wordml/sdtdatahash" xmlns:w16se="http://schemas.microsoft.com/office/word/2015/wordml/symex" mc:Ignorable="w14 w15 w16se w16cid w16 w16cex w16sdtdh">
+<w:styles xmlns:mc="http://schemas.openxmlformats.org/markup-compatibility/2006" xmlns:r="http://schemas.openxmlformats.org/officeDocument/2006/relationships" xmlns:w="http://schemas.openxmlformats.org/wordprocessingml/2006/main" xmlns:w14="http://schemas.microsoft.com/office/word/2010/wordml" xmlns:w15="http://schemas.microsoft.com/office/word/2012/wordml" xmlns:w16se="http://schemas.microsoft.com/office/word/2015/wordml/symex" mc:Ignorable="w14 w15 w16se">
   <w:docDefaults>
     <w:rPrDefault>
       <w:rPr>
@@ -5386,7 +5830,7 @@
       </w:pPr>
     </w:pPrDefault>
   </w:docDefaults>
-  <w:latentStyles w:defLockedState="0" w:defUIPriority="99" w:defSemiHidden="0" w:defUnhideWhenUsed="0" w:defQFormat="0" w:count="376">
+  <w:latentStyles w:defLockedState="0" w:defUIPriority="99" w:defSemiHidden="0" w:defUnhideWhenUsed="0" w:defQFormat="0" w:count="371">
     <w:lsdException w:name="Normal" w:uiPriority="0" w:qFormat="1"/>
     <w:lsdException w:name="heading 1" w:uiPriority="9" w:qFormat="1"/>
     <w:lsdException w:name="heading 2" w:semiHidden="1" w:uiPriority="0" w:unhideWhenUsed="1" w:qFormat="1"/>
@@ -5758,11 +6202,6 @@
     <w:lsdException w:name="List Table 5 Dark Accent 6" w:uiPriority="50"/>
     <w:lsdException w:name="List Table 6 Colorful Accent 6" w:uiPriority="51"/>
     <w:lsdException w:name="List Table 7 Colorful Accent 6" w:uiPriority="52"/>
-    <w:lsdException w:name="Mention" w:semiHidden="1" w:unhideWhenUsed="1"/>
-    <w:lsdException w:name="Smart Hyperlink" w:semiHidden="1" w:unhideWhenUsed="1"/>
-    <w:lsdException w:name="Hashtag" w:semiHidden="1" w:unhideWhenUsed="1"/>
-    <w:lsdException w:name="Unresolved Mention" w:semiHidden="1" w:unhideWhenUsed="1"/>
-    <w:lsdException w:name="Smart Link" w:semiHidden="1" w:unhideWhenUsed="1"/>
   </w:latentStyles>
   <w:style w:type="paragraph" w:default="1" w:styleId="a0">
     <w:name w:val="Normal"/>
@@ -6578,7 +7017,7 @@
 </file>
 
 <file path=customXml/itemProps1.xml><?xml version="1.0" encoding="utf-8"?>
-<ds:datastoreItem xmlns:ds="http://schemas.openxmlformats.org/officeDocument/2006/customXml" ds:itemID="{4C688DAC-FA35-4BB3-B489-783C915215C3}">
+<ds:datastoreItem xmlns:ds="http://schemas.openxmlformats.org/officeDocument/2006/customXml" ds:itemID="{7DC9ED2C-4D50-4750-A23E-541F91362789}">
   <ds:schemaRefs>
     <ds:schemaRef ds:uri="http://schemas.openxmlformats.org/officeDocument/2006/bibliography"/>
   </ds:schemaRefs>

</xml_diff>